<commit_message>
Actualización de la justificación técnica
</commit_message>
<xml_diff>
--- a/Equip_27/Data/justificaciones_tecnicas/Justificación_técnica_marketing_comunicacion_260420.docx
+++ b/Equip_27/Data/justificaciones_tecnicas/Justificación_técnica_marketing_comunicacion_260420.docx
@@ -32,7 +32,13 @@
         <w:pStyle w:val="Prrafodelista"/>
       </w:pPr>
       <w:r>
-        <w:t>Se eligió un análisis de proporciones porque permite ver directamente la tasa de éxito según el número de contactos, que es lo más relevante para marketing.</w:t>
+        <w:t>Se utilizó un análisis descriptivo basado en proporciones, ya que permite calcular la tasa de éxito según el número de contactos</w:t>
+      </w:r>
+      <w:r>
+        <w:t xml:space="preserve">, </w:t>
+      </w:r>
+      <w:r>
+        <w:t>que es lo más relevante para marketing.</w:t>
       </w:r>
     </w:p>
     <w:p>

</xml_diff>